<commit_message>
analysis plots, konza fire, and si
</commit_message>
<xml_diff>
--- a/Figs/Supplement/slope_table.docx
+++ b/Figs/Supplement/slope_table.docx
@@ -200,7 +200,7 @@
                 <w:rFonts w:ascii="Calibri" w:hAnsi="Calibri"/>
                 <w:sz w:val="20"/>
               </w:rPr>
-              <w:t xml:space="default">ND-1</w:t>
+              <w:t xml:space="default">SA-2</w:t>
             </w:r>
           </w:p>
         </w:tc>
@@ -373,7 +373,7 @@
                 <w:rFonts w:ascii="Calibri" w:hAnsi="Calibri"/>
                 <w:sz w:val="20"/>
               </w:rPr>
-              <w:t xml:space="default">ND-2</w:t>
+              <w:t xml:space="default">SA-1</w:t>
             </w:r>
           </w:p>
         </w:tc>
@@ -546,7 +546,7 @@
                 <w:rFonts w:ascii="Calibri" w:hAnsi="Calibri"/>
                 <w:sz w:val="20"/>
               </w:rPr>
-              <w:t xml:space="default">GP-1</w:t>
+              <w:t xml:space="default">SP-1</w:t>
             </w:r>
           </w:p>
         </w:tc>
@@ -719,7 +719,7 @@
                 <w:rFonts w:ascii="Calibri" w:hAnsi="Calibri"/>
                 <w:sz w:val="20"/>
               </w:rPr>
-              <w:t xml:space="default">GP-2</w:t>
+              <w:t xml:space="default">SP-2</w:t>
             </w:r>
           </w:p>
         </w:tc>
@@ -892,7 +892,7 @@
                 <w:rFonts w:ascii="Calibri" w:hAnsi="Calibri"/>
                 <w:sz w:val="20"/>
               </w:rPr>
-              <w:t xml:space="default">GP-3</w:t>
+              <w:t xml:space="default">SP-3</w:t>
             </w:r>
           </w:p>
         </w:tc>
@@ -1065,7 +1065,7 @@
                 <w:rFonts w:ascii="Calibri" w:hAnsi="Calibri"/>
                 <w:sz w:val="20"/>
               </w:rPr>
-              <w:t xml:space="default">EF-1</w:t>
+              <w:t xml:space="default">HF-3</w:t>
             </w:r>
           </w:p>
         </w:tc>
@@ -1238,7 +1238,7 @@
                 <w:rFonts w:ascii="Calibri" w:hAnsi="Calibri"/>
                 <w:sz w:val="20"/>
               </w:rPr>
-              <w:t xml:space="default">EF-3</w:t>
+              <w:t xml:space="default">HF-1</w:t>
             </w:r>
           </w:p>
         </w:tc>
@@ -1411,7 +1411,7 @@
                 <w:rFonts w:ascii="Calibri" w:hAnsi="Calibri"/>
                 <w:sz w:val="20"/>
               </w:rPr>
-              <w:t xml:space="default">EF-2</w:t>
+              <w:t xml:space="default">HF-2</w:t>
             </w:r>
           </w:p>
         </w:tc>

</xml_diff>